<commit_message>
Aula das indicações mostra expressões diferentes, não três iguais
Co-Authored-By: Claude Opus 5 <noreply@anthropic.com>
Claude-Session: https://claude.ai/code/session_014Qv8vUa47sQ8agnYCob2NZ
</commit_message>
<xml_diff>
--- a/apostila/Apostila-4o-periodo-candidato.docx
+++ b/apostila/Apostila-4o-periodo-candidato.docx
@@ -11525,7 +11525,7 @@
                 <w:sz w:val="19"/>
                 <w:szCs w:val="19"/>
               </w:rPr>
-              <w:t xml:space="preserve">Hinos 135, 367 e 390 — hinos que trazem indicação interpretativa impressa.</w:t>
+              <w:t xml:space="preserve">Hinos 135, 464 e 367 — hinos que trazem indicação interpretativa impressa.</w:t>
             </w:r>
           </w:p>
           <w:p>
@@ -11588,7 +11588,7 @@
                 <w:sz w:val="19"/>
                 <w:szCs w:val="19"/>
               </w:rPr>
-              <w:t xml:space="preserve">Hino 367 — Ré maior · Majestoso</w:t>
+              <w:t xml:space="preserve">Hino 464 — Mi♭ maior · Solene</w:t>
             </w:r>
           </w:p>
           <w:p>
@@ -11603,7 +11603,7 @@
                 <w:sz w:val="19"/>
                 <w:szCs w:val="19"/>
               </w:rPr>
-              <w:t xml:space="preserve">· O hino 367 traz a indicação “Majestoso”. O que muda na sua execução?</w:t>
+              <w:t xml:space="preserve">· O hino 464 traz a indicação “Solene”. O que muda na sua execução?</w:t>
             </w:r>
           </w:p>
           <w:p>
@@ -11635,7 +11635,7 @@
                 <w:sz w:val="19"/>
                 <w:szCs w:val="19"/>
               </w:rPr>
-              <w:t xml:space="preserve">Hino 390 — Dó maior · Majestoso</w:t>
+              <w:t xml:space="preserve">Hino 367 — Ré maior · Majestoso</w:t>
             </w:r>
           </w:p>
           <w:p>
@@ -11650,7 +11650,7 @@
                 <w:sz w:val="19"/>
                 <w:szCs w:val="19"/>
               </w:rPr>
-              <w:t xml:space="preserve">· O hino 390 traz a indicação “Majestoso”. O que muda na sua execução?</w:t>
+              <w:t xml:space="preserve">· O hino 367 traz a indicação “Majestoso”. O que muda na sua execução?</w:t>
             </w:r>
           </w:p>
           <w:p>

</xml_diff>

<commit_message>
Síncopa e contratempo conferidos na foto do caderno do GEM
O Anderson mandou a foto da página do 4º período, aulas 4 e 5, com as
duas listas lado a lado. Conferi número por número: a leitura automática
do PDF tinha acertado as duas colunas inteiras — 43 hinos na síncopa,
48 no contratempo, nenhuma troca entre as listas.

Sai a ressalva "conferir no impresso", que já não vale. Entram duas
observações do próprio caderno: a lista da síncopa fecha com o Coro 2,
que não tem número de hino e por isso não cabe no campo, e seis hinos
aparecem nas duas listas — 208, 236, 255, 381, 410 e 434 —, o que é do
caderno e não engano de leitura.

Co-Authored-By: Claude Opus 5 <noreply@anthropic.com>
Claude-Session: https://claude.ai/code/session_014Qv8vUa47sQ8agnYCob2NZ
</commit_message>
<xml_diff>
--- a/apostila/Apostila-4o-periodo-candidato.docx
+++ b/apostila/Apostila-4o-periodo-candidato.docx
@@ -3994,7 +3994,7 @@
                 <w:sz w:val="16"/>
                 <w:szCs w:val="16"/>
               </w:rPr>
-              <w:t xml:space="preserve">No caderno, síncopa e contratempo vêm em duas colunas lado a lado; a leitura automática do PDF separou as colunas pela numeração crescente. Conferir no impresso antes de usar em prova.</w:t>
+              <w:t xml:space="preserve">O caderno fecha a lista com o Coro 2, que não entra aqui por não ter número de hino.</w:t>
             </w:r>
           </w:p>
           <w:p>
@@ -4040,7 +4040,7 @@
                 <w:sz w:val="16"/>
                 <w:szCs w:val="16"/>
               </w:rPr>
-              <w:t xml:space="preserve">Mesma ressalva da lista de síncopa.</w:t>
+              <w:t xml:space="preserve">Seis hinos estão nas duas listas — 208, 236, 255, 381, 410 e 434 —, e isso é do caderno: o mesmo hino traz as duas figuras.</w:t>
             </w:r>
           </w:p>
           <w:p>
@@ -4851,7 +4851,7 @@
                 <w:sz w:val="16"/>
                 <w:szCs w:val="16"/>
               </w:rPr>
-              <w:t xml:space="preserve">No caderno, síncopa e contratempo vêm em duas colunas lado a lado; a leitura automática do PDF separou as colunas pela numeração crescente. Conferir no impresso antes de usar em prova.</w:t>
+              <w:t xml:space="preserve">O caderno fecha a lista com o Coro 2, que não entra aqui por não ter número de hino.</w:t>
             </w:r>
           </w:p>
           <w:p>
@@ -4897,7 +4897,7 @@
                 <w:sz w:val="16"/>
                 <w:szCs w:val="16"/>
               </w:rPr>
-              <w:t xml:space="preserve">Mesma ressalva da lista de síncopa.</w:t>
+              <w:t xml:space="preserve">Seis hinos estão nas duas listas — 208, 236, 255, 381, 410 e 434 —, e isso é do caderno: o mesmo hino traz as duas figuras.</w:t>
             </w:r>
           </w:p>
           <w:p>

</xml_diff>